<commit_message>
feat(report): formalize built-in report typography
</commit_message>
<xml_diff>
--- a/examples/report-templates/course-design-report-template.docx
+++ b/examples/report-templates/course-design-report-template.docx
@@ -12,7 +12,7 @@
         <w:rPr>
           <w:rFonts w:ascii="Arial" w:hAnsi="Arial" w:eastAsia="黑体"/>
           <w:b/>
-          <w:color w:val="202A35"/>
+          <w:color w:val="000000"/>
           <w:sz w:val="52"/>
         </w:rPr>
         <w:t>课程设计报告</w:t>
@@ -26,9 +26,9 @@
       </w:pPr>
       <w:r>
         <w:rPr>
-          <w:rFonts w:ascii="Arial" w:hAnsi="Arial" w:eastAsia="微软雅黑"/>
+          <w:rFonts w:ascii="Times New Roman" w:hAnsi="Times New Roman" w:eastAsia="宋体"/>
           <w:b w:val="0"/>
-          <w:color w:val="5E6B78"/>
+          <w:color w:val="666666"/>
           <w:sz w:val="19"/>
         </w:rPr>
         <w:t>COURSE DESIGN REPORT</w:t>
@@ -44,7 +44,7 @@
         <w:rPr>
           <w:rFonts w:ascii="Times New Roman" w:hAnsi="Times New Roman" w:eastAsia="宋体"/>
           <w:b/>
-          <w:color w:val="202A35"/>
+          <w:color w:val="000000"/>
           <w:sz w:val="28"/>
         </w:rPr>
         <w:t>课题名称：</w:t>
@@ -98,7 +98,7 @@
               <w:rPr>
                 <w:rFonts w:ascii="Arial" w:hAnsi="Arial" w:eastAsia="黑体"/>
                 <w:b/>
-                <w:color w:val="202A35"/>
+                <w:color w:val="000000"/>
                 <w:sz w:val="21"/>
               </w:rPr>
               <w:t>学生姓名</w:t>
@@ -132,7 +132,7 @@
               <w:rPr>
                 <w:rFonts w:ascii="Times New Roman" w:hAnsi="Times New Roman" w:eastAsia="宋体"/>
                 <w:b w:val="0"/>
-                <w:color w:val="202A35"/>
+                <w:color w:val="000000"/>
                 <w:sz w:val="21"/>
               </w:rPr>
             </w:r>
@@ -168,7 +168,7 @@
               <w:rPr>
                 <w:rFonts w:ascii="Arial" w:hAnsi="Arial" w:eastAsia="黑体"/>
                 <w:b/>
-                <w:color w:val="202A35"/>
+                <w:color w:val="000000"/>
                 <w:sz w:val="21"/>
               </w:rPr>
               <w:t>学号</w:t>
@@ -202,7 +202,7 @@
               <w:rPr>
                 <w:rFonts w:ascii="Times New Roman" w:hAnsi="Times New Roman" w:eastAsia="宋体"/>
                 <w:b w:val="0"/>
-                <w:color w:val="202A35"/>
+                <w:color w:val="000000"/>
                 <w:sz w:val="21"/>
               </w:rPr>
             </w:r>
@@ -238,7 +238,7 @@
               <w:rPr>
                 <w:rFonts w:ascii="Arial" w:hAnsi="Arial" w:eastAsia="黑体"/>
                 <w:b/>
-                <w:color w:val="202A35"/>
+                <w:color w:val="000000"/>
                 <w:sz w:val="21"/>
               </w:rPr>
               <w:t>班级</w:t>
@@ -272,7 +272,7 @@
               <w:rPr>
                 <w:rFonts w:ascii="Times New Roman" w:hAnsi="Times New Roman" w:eastAsia="宋体"/>
                 <w:b w:val="0"/>
-                <w:color w:val="202A35"/>
+                <w:color w:val="000000"/>
                 <w:sz w:val="21"/>
               </w:rPr>
             </w:r>
@@ -308,7 +308,7 @@
               <w:rPr>
                 <w:rFonts w:ascii="Arial" w:hAnsi="Arial" w:eastAsia="黑体"/>
                 <w:b/>
-                <w:color w:val="202A35"/>
+                <w:color w:val="000000"/>
                 <w:sz w:val="21"/>
               </w:rPr>
               <w:t>课程名称</w:t>
@@ -342,7 +342,7 @@
               <w:rPr>
                 <w:rFonts w:ascii="Times New Roman" w:hAnsi="Times New Roman" w:eastAsia="宋体"/>
                 <w:b w:val="0"/>
-                <w:color w:val="202A35"/>
+                <w:color w:val="000000"/>
                 <w:sz w:val="21"/>
               </w:rPr>
             </w:r>
@@ -378,7 +378,7 @@
               <w:rPr>
                 <w:rFonts w:ascii="Arial" w:hAnsi="Arial" w:eastAsia="黑体"/>
                 <w:b/>
-                <w:color w:val="202A35"/>
+                <w:color w:val="000000"/>
                 <w:sz w:val="21"/>
               </w:rPr>
               <w:t>指导教师</w:t>
@@ -412,7 +412,7 @@
               <w:rPr>
                 <w:rFonts w:ascii="Times New Roman" w:hAnsi="Times New Roman" w:eastAsia="宋体"/>
                 <w:b w:val="0"/>
-                <w:color w:val="202A35"/>
+                <w:color w:val="000000"/>
                 <w:sz w:val="21"/>
               </w:rPr>
             </w:r>
@@ -448,7 +448,7 @@
               <w:rPr>
                 <w:rFonts w:ascii="Arial" w:hAnsi="Arial" w:eastAsia="黑体"/>
                 <w:b/>
-                <w:color w:val="202A35"/>
+                <w:color w:val="000000"/>
                 <w:sz w:val="21"/>
               </w:rPr>
               <w:t>完成时间</w:t>
@@ -482,7 +482,7 @@
               <w:rPr>
                 <w:rFonts w:ascii="Times New Roman" w:hAnsi="Times New Roman" w:eastAsia="宋体"/>
                 <w:b w:val="0"/>
-                <w:color w:val="202A35"/>
+                <w:color w:val="000000"/>
                 <w:sz w:val="21"/>
               </w:rPr>
             </w:r>
@@ -527,7 +527,7 @@
         <w:rPr>
           <w:rFonts w:ascii="Times New Roman" w:hAnsi="Times New Roman" w:eastAsia="宋体"/>
           <w:b w:val="0"/>
-          <w:color w:val="777777"/>
+          <w:color w:val="000000"/>
           <w:sz w:val="24"/>
         </w:rPr>
       </w:r>
@@ -550,7 +550,7 @@
         <w:rPr>
           <w:rFonts w:ascii="Times New Roman" w:hAnsi="Times New Roman" w:eastAsia="宋体"/>
           <w:b w:val="0"/>
-          <w:color w:val="777777"/>
+          <w:color w:val="000000"/>
           <w:sz w:val="24"/>
         </w:rPr>
       </w:r>
@@ -573,7 +573,7 @@
         <w:rPr>
           <w:rFonts w:ascii="Times New Roman" w:hAnsi="Times New Roman" w:eastAsia="宋体"/>
           <w:b w:val="0"/>
-          <w:color w:val="777777"/>
+          <w:color w:val="000000"/>
           <w:sz w:val="24"/>
         </w:rPr>
       </w:r>
@@ -596,7 +596,7 @@
         <w:rPr>
           <w:rFonts w:ascii="Times New Roman" w:hAnsi="Times New Roman" w:eastAsia="宋体"/>
           <w:b w:val="0"/>
-          <w:color w:val="777777"/>
+          <w:color w:val="000000"/>
           <w:sz w:val="24"/>
         </w:rPr>
       </w:r>
@@ -619,7 +619,7 @@
         <w:rPr>
           <w:rFonts w:ascii="Times New Roman" w:hAnsi="Times New Roman" w:eastAsia="宋体"/>
           <w:b w:val="0"/>
-          <w:color w:val="777777"/>
+          <w:color w:val="000000"/>
           <w:sz w:val="24"/>
         </w:rPr>
       </w:r>
@@ -642,7 +642,7 @@
         <w:rPr>
           <w:rFonts w:ascii="Times New Roman" w:hAnsi="Times New Roman" w:eastAsia="宋体"/>
           <w:b w:val="0"/>
-          <w:color w:val="777777"/>
+          <w:color w:val="000000"/>
           <w:sz w:val="24"/>
         </w:rPr>
       </w:r>
@@ -665,7 +665,7 @@
         <w:rPr>
           <w:rFonts w:ascii="Times New Roman" w:hAnsi="Times New Roman" w:eastAsia="宋体"/>
           <w:b w:val="0"/>
-          <w:color w:val="777777"/>
+          <w:color w:val="000000"/>
           <w:sz w:val="24"/>
         </w:rPr>
       </w:r>
@@ -688,7 +688,7 @@
         <w:rPr>
           <w:rFonts w:ascii="Times New Roman" w:hAnsi="Times New Roman" w:eastAsia="宋体"/>
           <w:b w:val="0"/>
-          <w:color w:val="777777"/>
+          <w:color w:val="000000"/>
           <w:sz w:val="24"/>
         </w:rPr>
       </w:r>
@@ -711,7 +711,7 @@
         <w:rPr>
           <w:rFonts w:ascii="Times New Roman" w:hAnsi="Times New Roman" w:eastAsia="宋体"/>
           <w:b w:val="0"/>
-          <w:color w:val="777777"/>
+          <w:color w:val="000000"/>
           <w:sz w:val="24"/>
         </w:rPr>
       </w:r>
@@ -734,7 +734,7 @@
         <w:rPr>
           <w:rFonts w:ascii="Times New Roman" w:hAnsi="Times New Roman" w:eastAsia="宋体"/>
           <w:b w:val="0"/>
-          <w:color w:val="777777"/>
+          <w:color w:val="000000"/>
           <w:sz w:val="24"/>
         </w:rPr>
       </w:r>
@@ -761,12 +761,18 @@
       <w:rPr>
         <w:rFonts w:ascii="Times New Roman" w:hAnsi="Times New Roman" w:eastAsia="宋体"/>
         <w:b w:val="0"/>
-        <w:color w:val="5E6B78"/>
+        <w:color w:val="666666"/>
         <w:sz w:val="18"/>
       </w:rPr>
       <w:t xml:space="preserve">第 </w:t>
     </w:r>
     <w:r>
+      <w:rPr>
+        <w:rFonts w:ascii="Times New Roman" w:hAnsi="Times New Roman" w:eastAsia="宋体"/>
+        <w:b w:val="0"/>
+        <w:color w:val="666666"/>
+        <w:sz w:val="18"/>
+      </w:rPr>
       <w:fldChar w:fldCharType="begin"/>
       <w:instrText xml:space="preserve"> PAGE </w:instrText>
       <w:fldChar w:fldCharType="separate"/>
@@ -777,7 +783,7 @@
       <w:rPr>
         <w:rFonts w:ascii="Times New Roman" w:hAnsi="Times New Roman" w:eastAsia="宋体"/>
         <w:b w:val="0"/>
-        <w:color w:val="5E6B78"/>
+        <w:color w:val="666666"/>
         <w:sz w:val="18"/>
       </w:rPr>
       <w:t xml:space="preserve"> 页</w:t>
@@ -796,10 +802,10 @@
     </w:pPr>
     <w:r>
       <w:rPr>
-        <w:rFonts w:ascii="Arial" w:hAnsi="Arial" w:eastAsia="微软雅黑"/>
+        <w:rFonts w:ascii="Times New Roman" w:hAnsi="Times New Roman" w:eastAsia="宋体"/>
         <w:b w:val="0"/>
-        <w:color w:val="5E6B78"/>
-        <w:sz w:val="17"/>
+        <w:color w:val="666666"/>
+        <w:sz w:val="18"/>
       </w:rPr>
       <w:t>课程设计报告</w:t>
     </w:r>
@@ -1171,13 +1177,13 @@
     <w:qFormat/>
     <w:rsid w:val="00FC693F"/>
     <w:pPr>
-      <w:spacing w:before="0" w:after="120" w:line="360" w:lineRule="auto"/>
+      <w:spacing w:before="0" w:after="0" w:line="360" w:lineRule="auto"/>
       <w:ind w:firstLine="480"/>
     </w:pPr>
     <w:rPr>
       <w:rFonts w:ascii="Times New Roman" w:hAnsi="Times New Roman" w:eastAsia="宋体"/>
       <w:b w:val="0"/>
-      <w:color w:val="202A35"/>
+      <w:color w:val="000000"/>
       <w:sz w:val="24"/>
     </w:rPr>
   </w:style>
@@ -1244,8 +1250,8 @@
       <w:rFonts w:asciiTheme="majorHAnsi" w:eastAsiaTheme="majorEastAsia" w:hAnsiTheme="majorHAnsi" w:cstheme="majorBidi" w:ascii="Arial" w:hAnsi="Arial" w:eastAsia="黑体"/>
       <w:b/>
       <w:bCs/>
-      <w:color w:val="202A35"/>
-      <w:sz w:val="28"/>
+      <w:color w:val="000000"/>
+      <w:sz w:val="30"/>
       <w:szCs w:val="28"/>
     </w:rPr>
   </w:style>
@@ -1261,7 +1267,7 @@
     <w:pPr>
       <w:keepNext/>
       <w:keepLines/>
-      <w:spacing w:before="200" w:after="100"/>
+      <w:spacing w:before="160" w:after="80"/>
       <w:ind w:firstLine="0"/>
       <w:outlineLvl w:val="1"/>
     </w:pPr>
@@ -1269,8 +1275,8 @@
       <w:rFonts w:asciiTheme="majorHAnsi" w:eastAsiaTheme="majorEastAsia" w:hAnsiTheme="majorHAnsi" w:cstheme="majorBidi" w:ascii="Arial" w:hAnsi="Arial" w:eastAsia="黑体"/>
       <w:b/>
       <w:bCs/>
-      <w:color w:val="202A35"/>
-      <w:sz w:val="25"/>
+      <w:color w:val="000000"/>
+      <w:sz w:val="24"/>
       <w:szCs w:val="26"/>
     </w:rPr>
   </w:style>
@@ -1286,7 +1292,7 @@
     <w:pPr>
       <w:keepNext/>
       <w:keepLines/>
-      <w:spacing w:before="160" w:after="80"/>
+      <w:spacing w:before="120" w:after="60"/>
       <w:ind w:firstLine="0"/>
       <w:outlineLvl w:val="2"/>
     </w:pPr>
@@ -1294,8 +1300,8 @@
       <w:rFonts w:asciiTheme="majorHAnsi" w:eastAsiaTheme="majorEastAsia" w:hAnsiTheme="majorHAnsi" w:cstheme="majorBidi" w:ascii="Arial" w:hAnsi="Arial" w:eastAsia="黑体"/>
       <w:b/>
       <w:bCs/>
-      <w:color w:val="202A35"/>
-      <w:sz w:val="24"/>
+      <w:color w:val="000000"/>
+      <w:sz w:val="22"/>
     </w:rPr>
   </w:style>
   <w:style w:type="paragraph" w:styleId="Heading4">
@@ -1972,13 +1978,17 @@
     <w:qFormat/>
     <w:rsid w:val="00FC693F"/>
     <w:pPr>
-      <w:spacing w:line="240" w:lineRule="auto"/>
+      <w:keepLines/>
+      <w:spacing w:line="240" w:lineRule="auto" w:before="60" w:after="120"/>
+      <w:ind w:firstLine="0"/>
+      <w:jc w:val="center"/>
     </w:pPr>
     <w:rPr>
-      <w:b/>
+      <w:rFonts w:ascii="Times New Roman" w:hAnsi="Times New Roman" w:eastAsia="宋体"/>
+      <w:b w:val="0"/>
       <w:bCs/>
-      <w:color w:val="4F81BD" w:themeColor="accent1"/>
-      <w:sz w:val="18"/>
+      <w:color w:val="000000"/>
+      <w:sz w:val="21"/>
       <w:szCs w:val="18"/>
     </w:rPr>
   </w:style>

</xml_diff>

<commit_message>
feat: expand report template catalog and fidelity tests
</commit_message>
<xml_diff>
--- a/examples/report-templates/course-design-report-template.docx
+++ b/examples/report-templates/course-design-report-template.docx
@@ -86,6 +86,7 @@
               <w:bottom w:val="single" w:sz="8" w:space="0" w:color="707070"/>
               <w:right w:val="single" w:sz="8" w:space="0" w:color="707070"/>
             </w:tcBorders>
+            <w:noWrap/>
             <w:shd w:fill="F2F4F6"/>
           </w:tcPr>
           <w:p>
@@ -156,6 +157,7 @@
               <w:bottom w:val="single" w:sz="8" w:space="0" w:color="707070"/>
               <w:right w:val="single" w:sz="8" w:space="0" w:color="707070"/>
             </w:tcBorders>
+            <w:noWrap/>
             <w:shd w:fill="F2F4F6"/>
           </w:tcPr>
           <w:p>
@@ -226,6 +228,7 @@
               <w:bottom w:val="single" w:sz="8" w:space="0" w:color="707070"/>
               <w:right w:val="single" w:sz="8" w:space="0" w:color="707070"/>
             </w:tcBorders>
+            <w:noWrap/>
             <w:shd w:fill="F2F4F6"/>
           </w:tcPr>
           <w:p>
@@ -296,6 +299,7 @@
               <w:bottom w:val="single" w:sz="8" w:space="0" w:color="707070"/>
               <w:right w:val="single" w:sz="8" w:space="0" w:color="707070"/>
             </w:tcBorders>
+            <w:noWrap/>
             <w:shd w:fill="F2F4F6"/>
           </w:tcPr>
           <w:p>
@@ -366,6 +370,7 @@
               <w:bottom w:val="single" w:sz="8" w:space="0" w:color="707070"/>
               <w:right w:val="single" w:sz="8" w:space="0" w:color="707070"/>
             </w:tcBorders>
+            <w:noWrap/>
             <w:shd w:fill="F2F4F6"/>
           </w:tcPr>
           <w:p>
@@ -436,6 +441,7 @@
               <w:bottom w:val="single" w:sz="8" w:space="0" w:color="707070"/>
               <w:right w:val="single" w:sz="8" w:space="0" w:color="707070"/>
             </w:tcBorders>
+            <w:noWrap/>
             <w:shd w:fill="F2F4F6"/>
           </w:tcPr>
           <w:p>

</xml_diff>